<commit_message>
Formatar folha de cota em Arial 12 justificado
</commit_message>
<xml_diff>
--- a/public/docflow/templates/MODELO_FOLHA_COTA.docx
+++ b/public/docflow/templates/MODELO_FOLHA_COTA.docx
@@ -172,11 +172,13 @@
                 <w:rFonts w:ascii="Bookman Old Style" w:hAnsi="Bookman Old Style"/>
                 <w:szCs w:val="24"/>
               </w:rPr>
+              <w:jc w:val="both"/>
             </w:pPr>
             <w:r>
               <w:rPr>
-                <w:rFonts w:ascii="Bookman Old Style" w:hAnsi="Bookman Old Style"/>
-                <w:szCs w:val="24"/>
+                <w:rFonts w:ascii="Arial" w:hAnsi="Arial" w:eastAsia="Arial" w:cs="Arial"/>
+                <w:szCs w:val="24"/>
+                <w:sz w:val="24"/>
               </w:rPr>
               <w:t xml:space="preserve">{{line_01}}</w:t>
             </w:r>
@@ -226,11 +228,13 @@
                 <w:rFonts w:ascii="Bookman Old Style" w:hAnsi="Bookman Old Style"/>
                 <w:szCs w:val="24"/>
               </w:rPr>
+              <w:jc w:val="both"/>
             </w:pPr>
             <w:r>
               <w:rPr>
-                <w:rFonts w:ascii="Bookman Old Style" w:hAnsi="Bookman Old Style"/>
-                <w:szCs w:val="24"/>
+                <w:rFonts w:ascii="Arial" w:hAnsi="Arial" w:eastAsia="Arial" w:cs="Arial"/>
+                <w:szCs w:val="24"/>
+                <w:sz w:val="24"/>
               </w:rPr>
               <w:t xml:space="preserve">{{line_02}}</w:t>
             </w:r>
@@ -275,11 +279,13 @@
           <w:p>
             <w:pPr>
               <w:pStyle w:val="pdq2pgselectionanchorcontainer"/>
+              <w:jc w:val="both"/>
             </w:pPr>
             <w:r>
               <w:rPr>
-                <w:rFonts w:ascii="Bookman Old Style" w:hAnsi="Bookman Old Style"/>
-                <w:szCs w:val="24"/>
+                <w:rFonts w:ascii="Arial" w:hAnsi="Arial" w:eastAsia="Arial" w:cs="Arial"/>
+                <w:szCs w:val="24"/>
+                <w:sz w:val="24"/>
               </w:rPr>
               <w:t xml:space="preserve">{{line_03}}</w:t>
             </w:r>
@@ -328,8 +334,9 @@
             </w:pPr>
             <w:r>
               <w:rPr>
-                <w:rFonts w:ascii="Bookman Old Style" w:hAnsi="Bookman Old Style"/>
-                <w:szCs w:val="24"/>
+                <w:rFonts w:ascii="Arial" w:hAnsi="Arial" w:eastAsia="Arial" w:cs="Arial"/>
+                <w:szCs w:val="24"/>
+                <w:sz w:val="24"/>
               </w:rPr>
               <w:t xml:space="preserve">{{line_04}}</w:t>
             </w:r>
@@ -386,11 +393,13 @@
                 <w:rFonts w:ascii="Bookman Old Style" w:hAnsi="Bookman Old Style"/>
                 <w:szCs w:val="24"/>
               </w:rPr>
+              <w:jc w:val="both"/>
             </w:pPr>
             <w:r>
               <w:rPr>
-                <w:rFonts w:ascii="Bookman Old Style" w:hAnsi="Bookman Old Style"/>
-                <w:szCs w:val="24"/>
+                <w:rFonts w:ascii="Arial" w:hAnsi="Arial" w:eastAsia="Arial" w:cs="Arial"/>
+                <w:szCs w:val="24"/>
+                <w:sz w:val="24"/>
               </w:rPr>
               <w:t xml:space="preserve">{{line_05}}</w:t>
             </w:r>
@@ -449,11 +458,13 @@
                 <w:rFonts w:ascii="Bookman Old Style" w:hAnsi="Bookman Old Style"/>
                 <w:szCs w:val="24"/>
               </w:rPr>
+              <w:jc w:val="both"/>
             </w:pPr>
             <w:r>
               <w:rPr>
-                <w:rFonts w:ascii="Bookman Old Style" w:hAnsi="Bookman Old Style"/>
-                <w:szCs w:val="24"/>
+                <w:rFonts w:ascii="Arial" w:hAnsi="Arial" w:eastAsia="Arial" w:cs="Arial"/>
+                <w:szCs w:val="24"/>
+                <w:sz w:val="24"/>
               </w:rPr>
               <w:t xml:space="preserve">{{line_06}}</w:t>
             </w:r>
@@ -504,11 +515,13 @@
                 <w:rFonts w:ascii="Bookman Old Style" w:hAnsi="Bookman Old Style"/>
                 <w:szCs w:val="24"/>
               </w:rPr>
+              <w:jc w:val="both"/>
             </w:pPr>
             <w:r>
               <w:rPr>
-                <w:rFonts w:ascii="Bookman Old Style" w:hAnsi="Bookman Old Style"/>
-                <w:szCs w:val="24"/>
+                <w:rFonts w:ascii="Arial" w:hAnsi="Arial" w:eastAsia="Arial" w:cs="Arial"/>
+                <w:szCs w:val="24"/>
+                <w:sz w:val="24"/>
               </w:rPr>
               <w:t xml:space="preserve">{{line_07}}</w:t>
             </w:r>
@@ -555,15 +568,16 @@
               <w:pStyle w:val="Cabealho"/>
               <w:snapToGrid w:val="0"/>
               <w:spacing w:line="360" w:lineRule="exact"/>
-              <w:jc w:val="center"/>
+              <w:jc w:val="both"/>
               <w:rPr>
                 <w:rFonts w:ascii="Bookman Old Style" w:hAnsi="Bookman Old Style"/>
               </w:rPr>
             </w:pPr>
             <w:r>
               <w:rPr>
-                <w:rFonts w:ascii="Bookman Old Style" w:hAnsi="Bookman Old Style"/>
-                <w:szCs w:val="24"/>
+                <w:rFonts w:ascii="Arial" w:hAnsi="Arial" w:eastAsia="Arial" w:cs="Arial"/>
+                <w:szCs w:val="24"/>
+                <w:sz w:val="24"/>
               </w:rPr>
               <w:t xml:space="preserve">{{line_08}}</w:t>
             </w:r>
@@ -611,7 +625,7 @@
               <w:pStyle w:val="Cabealho"/>
               <w:snapToGrid w:val="0"/>
               <w:spacing w:line="360" w:lineRule="exact"/>
-              <w:jc w:val="center"/>
+              <w:jc w:val="both"/>
               <w:rPr>
                 <w:rFonts w:ascii="Bookman Old Style" w:hAnsi="Bookman Old Style"/>
                 <w:sz w:val="22"/>
@@ -620,8 +634,9 @@
             </w:pPr>
             <w:r>
               <w:rPr>
-                <w:rFonts w:ascii="Bookman Old Style" w:hAnsi="Bookman Old Style"/>
-                <w:szCs w:val="24"/>
+                <w:rFonts w:ascii="Arial" w:hAnsi="Arial" w:eastAsia="Arial" w:cs="Arial"/>
+                <w:szCs w:val="24"/>
+                <w:sz w:val="24"/>
               </w:rPr>
               <w:t xml:space="preserve">{{line_09}}</w:t>
             </w:r>
@@ -678,11 +693,13 @@
                 <w:rFonts w:ascii="Bookman Old Style" w:hAnsi="Bookman Old Style"/>
                 <w:szCs w:val="24"/>
               </w:rPr>
+              <w:jc w:val="both"/>
             </w:pPr>
             <w:r>
               <w:rPr>
-                <w:rFonts w:ascii="Bookman Old Style" w:hAnsi="Bookman Old Style"/>
-                <w:szCs w:val="24"/>
+                <w:rFonts w:ascii="Arial" w:hAnsi="Arial" w:eastAsia="Arial" w:cs="Arial"/>
+                <w:szCs w:val="24"/>
+                <w:sz w:val="24"/>
               </w:rPr>
               <w:t xml:space="preserve">{{line_10}}</w:t>
             </w:r>
@@ -733,15 +750,16 @@
               </w:tabs>
               <w:snapToGrid w:val="0"/>
               <w:spacing w:line="360" w:lineRule="exact"/>
-              <w:jc w:val="center"/>
+              <w:jc w:val="both"/>
               <w:rPr>
                 <w:rFonts w:ascii="Bookman Old Style" w:hAnsi="Bookman Old Style"/>
               </w:rPr>
             </w:pPr>
             <w:r>
               <w:rPr>
-                <w:rFonts w:ascii="Bookman Old Style" w:hAnsi="Bookman Old Style"/>
-                <w:szCs w:val="24"/>
+                <w:rFonts w:ascii="Arial" w:hAnsi="Arial" w:eastAsia="Arial" w:cs="Arial"/>
+                <w:szCs w:val="24"/>
+                <w:sz w:val="24"/>
               </w:rPr>
               <w:t xml:space="preserve">{{line_11}}</w:t>
             </w:r>
@@ -796,11 +814,13 @@
                 <w:rFonts w:ascii="Bookman Old Style" w:hAnsi="Bookman Old Style"/>
                 <w:szCs w:val="24"/>
               </w:rPr>
+              <w:jc w:val="both"/>
             </w:pPr>
             <w:r>
               <w:rPr>
-                <w:rFonts w:ascii="Bookman Old Style" w:hAnsi="Bookman Old Style"/>
-                <w:szCs w:val="24"/>
+                <w:rFonts w:ascii="Arial" w:hAnsi="Arial" w:eastAsia="Arial" w:cs="Arial"/>
+                <w:szCs w:val="24"/>
+                <w:sz w:val="24"/>
               </w:rPr>
               <w:t xml:space="preserve">{{line_12}}</w:t>
             </w:r>
@@ -855,11 +875,13 @@
                 <w:rFonts w:ascii="Bookman Old Style" w:hAnsi="Bookman Old Style"/>
                 <w:szCs w:val="24"/>
               </w:rPr>
+              <w:jc w:val="both"/>
             </w:pPr>
             <w:r>
               <w:rPr>
-                <w:rFonts w:ascii="Bookman Old Style" w:hAnsi="Bookman Old Style"/>
-                <w:szCs w:val="24"/>
+                <w:rFonts w:ascii="Arial" w:hAnsi="Arial" w:eastAsia="Arial" w:cs="Arial"/>
+                <w:szCs w:val="24"/>
+                <w:sz w:val="24"/>
               </w:rPr>
               <w:t xml:space="preserve">{{line_13}}</w:t>
             </w:r>
@@ -912,11 +934,13 @@
               <w:rPr>
                 <w:rFonts w:ascii="Bookman Old Style" w:hAnsi="Bookman Old Style"/>
               </w:rPr>
+              <w:jc w:val="both"/>
             </w:pPr>
             <w:r>
               <w:rPr>
-                <w:rFonts w:ascii="Bookman Old Style" w:hAnsi="Bookman Old Style"/>
-                <w:szCs w:val="24"/>
+                <w:rFonts w:ascii="Arial" w:hAnsi="Arial" w:eastAsia="Arial" w:cs="Arial"/>
+                <w:szCs w:val="24"/>
+                <w:sz w:val="24"/>
               </w:rPr>
               <w:t xml:space="preserve">{{line_14}}</w:t>
             </w:r>
@@ -969,11 +993,13 @@
               <w:rPr>
                 <w:rFonts w:ascii="Bookman Old Style" w:hAnsi="Bookman Old Style"/>
               </w:rPr>
+              <w:jc w:val="both"/>
             </w:pPr>
             <w:r>
               <w:rPr>
-                <w:rFonts w:ascii="Bookman Old Style" w:hAnsi="Bookman Old Style"/>
-                <w:szCs w:val="24"/>
+                <w:rFonts w:ascii="Arial" w:hAnsi="Arial" w:eastAsia="Arial" w:cs="Arial"/>
+                <w:szCs w:val="24"/>
+                <w:sz w:val="24"/>
               </w:rPr>
               <w:t xml:space="preserve">{{line_15}}</w:t>
             </w:r>
@@ -1026,11 +1052,13 @@
               <w:rPr>
                 <w:rFonts w:ascii="Bookman Old Style" w:hAnsi="Bookman Old Style"/>
               </w:rPr>
+              <w:jc w:val="both"/>
             </w:pPr>
             <w:r>
               <w:rPr>
-                <w:rFonts w:ascii="Bookman Old Style" w:hAnsi="Bookman Old Style"/>
-                <w:szCs w:val="24"/>
+                <w:rFonts w:ascii="Arial" w:hAnsi="Arial" w:eastAsia="Arial" w:cs="Arial"/>
+                <w:szCs w:val="24"/>
+                <w:sz w:val="24"/>
               </w:rPr>
               <w:t xml:space="preserve">{{line_16}}</w:t>
             </w:r>
@@ -1083,11 +1111,13 @@
               <w:rPr>
                 <w:rFonts w:ascii="Bookman Old Style" w:hAnsi="Bookman Old Style"/>
               </w:rPr>
+              <w:jc w:val="both"/>
             </w:pPr>
             <w:r>
               <w:rPr>
-                <w:rFonts w:ascii="Bookman Old Style" w:hAnsi="Bookman Old Style"/>
-                <w:szCs w:val="24"/>
+                <w:rFonts w:ascii="Arial" w:hAnsi="Arial" w:eastAsia="Arial" w:cs="Arial"/>
+                <w:szCs w:val="24"/>
+                <w:sz w:val="24"/>
               </w:rPr>
               <w:t xml:space="preserve">{{line_17}}</w:t>
             </w:r>
@@ -1140,11 +1170,13 @@
               <w:rPr>
                 <w:rFonts w:ascii="Bookman Old Style" w:hAnsi="Bookman Old Style"/>
               </w:rPr>
+              <w:jc w:val="both"/>
             </w:pPr>
             <w:r>
               <w:rPr>
-                <w:rFonts w:ascii="Bookman Old Style" w:hAnsi="Bookman Old Style"/>
-                <w:szCs w:val="24"/>
+                <w:rFonts w:ascii="Arial" w:hAnsi="Arial" w:eastAsia="Arial" w:cs="Arial"/>
+                <w:szCs w:val="24"/>
+                <w:sz w:val="24"/>
               </w:rPr>
               <w:t xml:space="preserve">{{line_18}}</w:t>
             </w:r>
@@ -1197,11 +1229,13 @@
               <w:rPr>
                 <w:rFonts w:ascii="Bookman Old Style" w:hAnsi="Bookman Old Style"/>
               </w:rPr>
+              <w:jc w:val="both"/>
             </w:pPr>
             <w:r>
               <w:rPr>
-                <w:rFonts w:ascii="Bookman Old Style" w:hAnsi="Bookman Old Style"/>
-                <w:szCs w:val="24"/>
+                <w:rFonts w:ascii="Arial" w:hAnsi="Arial" w:eastAsia="Arial" w:cs="Arial"/>
+                <w:szCs w:val="24"/>
+                <w:sz w:val="24"/>
               </w:rPr>
               <w:t xml:space="preserve">{{line_19}}</w:t>
             </w:r>
@@ -1254,11 +1288,13 @@
               <w:rPr>
                 <w:rFonts w:ascii="Bookman Old Style" w:hAnsi="Bookman Old Style"/>
               </w:rPr>
+              <w:jc w:val="both"/>
             </w:pPr>
             <w:r>
               <w:rPr>
-                <w:rFonts w:ascii="Bookman Old Style" w:hAnsi="Bookman Old Style"/>
-                <w:szCs w:val="24"/>
+                <w:rFonts w:ascii="Arial" w:hAnsi="Arial" w:eastAsia="Arial" w:cs="Arial"/>
+                <w:szCs w:val="24"/>
+                <w:sz w:val="24"/>
               </w:rPr>
               <w:t xml:space="preserve">{{line_20}}</w:t>
             </w:r>
@@ -1311,11 +1347,13 @@
               <w:rPr>
                 <w:rFonts w:ascii="Bookman Old Style" w:hAnsi="Bookman Old Style"/>
               </w:rPr>
+              <w:jc w:val="both"/>
             </w:pPr>
             <w:r>
               <w:rPr>
-                <w:rFonts w:ascii="Bookman Old Style" w:hAnsi="Bookman Old Style"/>
-                <w:szCs w:val="24"/>
+                <w:rFonts w:ascii="Arial" w:hAnsi="Arial" w:eastAsia="Arial" w:cs="Arial"/>
+                <w:szCs w:val="24"/>
+                <w:sz w:val="24"/>
               </w:rPr>
               <w:t xml:space="preserve">{{line_21}}</w:t>
             </w:r>
@@ -1368,11 +1406,13 @@
               <w:rPr>
                 <w:rFonts w:ascii="Bookman Old Style" w:hAnsi="Bookman Old Style"/>
               </w:rPr>
+              <w:jc w:val="both"/>
             </w:pPr>
             <w:r>
               <w:rPr>
-                <w:rFonts w:ascii="Bookman Old Style" w:hAnsi="Bookman Old Style"/>
-                <w:szCs w:val="24"/>
+                <w:rFonts w:ascii="Arial" w:hAnsi="Arial" w:eastAsia="Arial" w:cs="Arial"/>
+                <w:szCs w:val="24"/>
+                <w:sz w:val="24"/>
               </w:rPr>
               <w:t xml:space="preserve">{{line_22}}</w:t>
             </w:r>
@@ -1425,11 +1465,13 @@
               <w:rPr>
                 <w:rFonts w:ascii="Bookman Old Style" w:hAnsi="Bookman Old Style"/>
               </w:rPr>
+              <w:jc w:val="both"/>
             </w:pPr>
             <w:r>
               <w:rPr>
-                <w:rFonts w:ascii="Bookman Old Style" w:hAnsi="Bookman Old Style"/>
-                <w:szCs w:val="24"/>
+                <w:rFonts w:ascii="Arial" w:hAnsi="Arial" w:eastAsia="Arial" w:cs="Arial"/>
+                <w:szCs w:val="24"/>
+                <w:sz w:val="24"/>
               </w:rPr>
               <w:t xml:space="preserve">{{line_23}}</w:t>
             </w:r>
@@ -1482,11 +1524,13 @@
               <w:rPr>
                 <w:rFonts w:ascii="Bookman Old Style" w:hAnsi="Bookman Old Style"/>
               </w:rPr>
+              <w:jc w:val="both"/>
             </w:pPr>
             <w:r>
               <w:rPr>
-                <w:rFonts w:ascii="Bookman Old Style" w:hAnsi="Bookman Old Style"/>
-                <w:szCs w:val="24"/>
+                <w:rFonts w:ascii="Arial" w:hAnsi="Arial" w:eastAsia="Arial" w:cs="Arial"/>
+                <w:szCs w:val="24"/>
+                <w:sz w:val="24"/>
               </w:rPr>
               <w:t xml:space="preserve">{{line_24}}</w:t>
             </w:r>
@@ -1539,11 +1583,13 @@
               <w:rPr>
                 <w:rFonts w:ascii="Bookman Old Style" w:hAnsi="Bookman Old Style"/>
               </w:rPr>
+              <w:jc w:val="both"/>
             </w:pPr>
             <w:r>
               <w:rPr>
-                <w:rFonts w:ascii="Bookman Old Style" w:hAnsi="Bookman Old Style"/>
-                <w:szCs w:val="24"/>
+                <w:rFonts w:ascii="Arial" w:hAnsi="Arial" w:eastAsia="Arial" w:cs="Arial"/>
+                <w:szCs w:val="24"/>
+                <w:sz w:val="24"/>
               </w:rPr>
               <w:t xml:space="preserve">{{line_25}}</w:t>
             </w:r>
@@ -1596,11 +1642,13 @@
               <w:rPr>
                 <w:rFonts w:ascii="Bookman Old Style" w:hAnsi="Bookman Old Style"/>
               </w:rPr>
+              <w:jc w:val="both"/>
             </w:pPr>
             <w:r>
               <w:rPr>
-                <w:rFonts w:ascii="Bookman Old Style" w:hAnsi="Bookman Old Style"/>
-                <w:szCs w:val="24"/>
+                <w:rFonts w:ascii="Arial" w:hAnsi="Arial" w:eastAsia="Arial" w:cs="Arial"/>
+                <w:szCs w:val="24"/>
+                <w:sz w:val="24"/>
               </w:rPr>
               <w:t xml:space="preserve">{{line_26}}</w:t>
             </w:r>
@@ -1653,11 +1701,13 @@
               <w:rPr>
                 <w:rFonts w:ascii="Bookman Old Style" w:hAnsi="Bookman Old Style"/>
               </w:rPr>
+              <w:jc w:val="both"/>
             </w:pPr>
             <w:r>
               <w:rPr>
-                <w:rFonts w:ascii="Bookman Old Style" w:hAnsi="Bookman Old Style"/>
-                <w:szCs w:val="24"/>
+                <w:rFonts w:ascii="Arial" w:hAnsi="Arial" w:eastAsia="Arial" w:cs="Arial"/>
+                <w:szCs w:val="24"/>
+                <w:sz w:val="24"/>
               </w:rPr>
               <w:t xml:space="preserve">{{line_27}}</w:t>
             </w:r>
@@ -1710,11 +1760,13 @@
               <w:rPr>
                 <w:rFonts w:ascii="Bookman Old Style" w:hAnsi="Bookman Old Style"/>
               </w:rPr>
+              <w:jc w:val="both"/>
             </w:pPr>
             <w:r>
               <w:rPr>
-                <w:rFonts w:ascii="Bookman Old Style" w:hAnsi="Bookman Old Style"/>
-                <w:szCs w:val="24"/>
+                <w:rFonts w:ascii="Arial" w:hAnsi="Arial" w:eastAsia="Arial" w:cs="Arial"/>
+                <w:szCs w:val="24"/>
+                <w:sz w:val="24"/>
               </w:rPr>
               <w:t xml:space="preserve">{{line_28}}</w:t>
             </w:r>
@@ -1767,11 +1819,13 @@
               <w:rPr>
                 <w:rFonts w:ascii="Bookman Old Style" w:hAnsi="Bookman Old Style"/>
               </w:rPr>
+              <w:jc w:val="both"/>
             </w:pPr>
             <w:r>
               <w:rPr>
-                <w:rFonts w:ascii="Bookman Old Style" w:hAnsi="Bookman Old Style"/>
-                <w:szCs w:val="24"/>
+                <w:rFonts w:ascii="Arial" w:hAnsi="Arial" w:eastAsia="Arial" w:cs="Arial"/>
+                <w:szCs w:val="24"/>
+                <w:sz w:val="24"/>
               </w:rPr>
               <w:t xml:space="preserve">{{line_29}}</w:t>
             </w:r>
@@ -1824,11 +1878,13 @@
               <w:rPr>
                 <w:rFonts w:ascii="Bookman Old Style" w:hAnsi="Bookman Old Style"/>
               </w:rPr>
+              <w:jc w:val="both"/>
             </w:pPr>
             <w:r>
               <w:rPr>
-                <w:rFonts w:ascii="Bookman Old Style" w:hAnsi="Bookman Old Style"/>
-                <w:szCs w:val="24"/>
+                <w:rFonts w:ascii="Arial" w:hAnsi="Arial" w:eastAsia="Arial" w:cs="Arial"/>
+                <w:szCs w:val="24"/>
+                <w:sz w:val="24"/>
               </w:rPr>
               <w:t xml:space="preserve">{{line_30}}</w:t>
             </w:r>
@@ -1881,11 +1937,13 @@
               <w:rPr>
                 <w:rFonts w:ascii="Bookman Old Style" w:hAnsi="Bookman Old Style"/>
               </w:rPr>
+              <w:jc w:val="both"/>
             </w:pPr>
             <w:r>
               <w:rPr>
-                <w:rFonts w:ascii="Bookman Old Style" w:hAnsi="Bookman Old Style"/>
-                <w:szCs w:val="24"/>
+                <w:rFonts w:ascii="Arial" w:hAnsi="Arial" w:eastAsia="Arial" w:cs="Arial"/>
+                <w:szCs w:val="24"/>
+                <w:sz w:val="24"/>
               </w:rPr>
               <w:t xml:space="preserve">{{line_31}}</w:t>
             </w:r>
@@ -1938,11 +1996,13 @@
               <w:rPr>
                 <w:rFonts w:ascii="Bookman Old Style" w:hAnsi="Bookman Old Style"/>
               </w:rPr>
+              <w:jc w:val="both"/>
             </w:pPr>
             <w:r>
               <w:rPr>
-                <w:rFonts w:ascii="Bookman Old Style" w:hAnsi="Bookman Old Style"/>
-                <w:szCs w:val="24"/>
+                <w:rFonts w:ascii="Arial" w:hAnsi="Arial" w:eastAsia="Arial" w:cs="Arial"/>
+                <w:szCs w:val="24"/>
+                <w:sz w:val="24"/>
               </w:rPr>
               <w:t xml:space="preserve">{{line_32}}</w:t>
             </w:r>

</xml_diff>

<commit_message>
Alinhar cabeçalho da folha de cota
</commit_message>
<xml_diff>
--- a/public/docflow/templates/MODELO_FOLHA_COTA.docx
+++ b/public/docflow/templates/MODELO_FOLHA_COTA.docx
@@ -68,69 +68,83 @@
     <w:p>
       <w:pPr>
         <w:pStyle w:val="Cabealho"/>
-        <w:tabs>
-          <w:tab w:val="clear" w:pos="4320"/>
-          <w:tab w:val="clear" w:pos="8640"/>
-        </w:tabs>
         <w:spacing w:line="360" w:lineRule="auto"/>
-        <w:jc w:val="center"/>
+        <w:ind w:right="176"/>
+        <w:jc w:val="right"/>
         <w:rPr>
-          <w:rFonts w:ascii="Times New Roman" w:hAnsi="Times New Roman"/>
-          <w:b/>
-          <w:i/>
+          <w:rFonts w:ascii="Arial" w:hAnsi="Arial" w:eastAsia="Arial" w:cs="Arial"/>
+          <w:b w:val="1"/>
+          <w:i w:val="0"/>
+          <w:sz w:val="24"/>
+          <w:szCs w:val="24"/>
         </w:rPr>
       </w:pPr>
       <w:r>
         <w:rPr>
-          <w:rFonts w:ascii="Times New Roman" w:hAnsi="Times New Roman"/>
-          <w:i/>
+          <w:rFonts w:ascii="Arial" w:hAnsi="Arial" w:eastAsia="Arial" w:cs="Arial"/>
+          <w:b w:val="1"/>
+          <w:i w:val="0"/>
+          <w:sz w:val="24"/>
         </w:rPr>
-        <w:t xml:space="preserve">                                                                                                                                         </w:t>
+        <w:t xml:space="preserve">Fl. n.º </w:t>
       </w:r>
       <w:r>
         <w:rPr>
-          <w:rFonts w:ascii="Times New Roman" w:hAnsi="Times New Roman"/>
-          <w:b/>
-          <w:i/>
+          <w:rFonts w:ascii="Arial" w:hAnsi="Arial" w:eastAsia="Arial" w:cs="Arial"/>
+          <w:b w:val="1"/>
+          <w:i w:val="0"/>
+          <w:sz w:val="24"/>
         </w:rPr>
-        <w:t>Fl. n.º{{sheet_number}}</w:t>
+        <w:t>{{sheet_number}}</w:t>
       </w:r>
     </w:p>
     <w:p>
       <w:pPr>
         <w:pStyle w:val="Cabealho"/>
-        <w:tabs>
-          <w:tab w:val="clear" w:pos="4320"/>
-          <w:tab w:val="clear" w:pos="8640"/>
-          <w:tab w:val="left" w:pos="4536"/>
-        </w:tabs>
         <w:spacing w:line="360" w:lineRule="auto"/>
+        <w:ind w:right="176"/>
+        <w:jc w:val="right"/>
         <w:rPr>
-          <w:rFonts w:ascii="Times New Roman" w:hAnsi="Times New Roman"/>
-          <w:b/>
-          <w:i/>
+          <w:rFonts w:ascii="Arial" w:hAnsi="Arial" w:eastAsia="Arial" w:cs="Arial"/>
+          <w:b w:val="1"/>
+          <w:i w:val="0"/>
+          <w:sz w:val="24"/>
+          <w:szCs w:val="24"/>
         </w:rPr>
       </w:pPr>
       <w:r>
         <w:rPr>
-          <w:rFonts w:ascii="Times New Roman" w:hAnsi="Times New Roman"/>
-          <w:b/>
-          <w:i/>
+          <w:rFonts w:ascii="Arial" w:hAnsi="Arial" w:eastAsia="Arial" w:cs="Arial"/>
+          <w:b w:val="1"/>
+          <w:i w:val="0"/>
+          <w:sz w:val="24"/>
         </w:rPr>
-        <w:t xml:space="preserve">                                                                                       Processo n.º  {{process_number}}  de</w:t>
+        <w:t xml:space="preserve">Processo n.º </w:t>
       </w:r>
       <w:r>
         <w:rPr>
-          <w:rFonts w:ascii="Times New Roman" w:hAnsi="Times New Roman"/>
-          <w:i/>
+          <w:rFonts w:ascii="Arial" w:hAnsi="Arial" w:eastAsia="Arial" w:cs="Arial"/>
+          <w:b w:val="1"/>
+          <w:i w:val="0"/>
+          <w:sz w:val="24"/>
         </w:rPr>
-        <w:t xml:space="preserve">       </w:t>
+        <w:t>{{process_number}}</w:t>
       </w:r>
       <w:r>
         <w:rPr>
-          <w:rFonts w:ascii="Times New Roman" w:hAnsi="Times New Roman"/>
-          <w:b/>
-          <w:i/>
+          <w:rFonts w:ascii="Arial" w:hAnsi="Arial" w:eastAsia="Arial" w:cs="Arial"/>
+          <w:b w:val="1"/>
+          <w:i w:val="0"/>
+          <w:sz w:val="24"/>
+        </w:rPr>
+        <w:t xml:space="preserve"> de </w:t>
+      </w:r>
+      <w:r>
+        <w:rPr>
+          <w:rFonts w:ascii="Arial" w:hAnsi="Arial" w:eastAsia="Arial" w:cs="Arial"/>
+          <w:b w:val="1"/>
+          <w:i w:val="0"/>
+          <w:sz w:val="24"/>
         </w:rPr>
         <w:t>{{process_year}}</w:t>
       </w:r>

</xml_diff>